<commit_message>
Sửa lại bảng workoutplan trong CSDL, kết nối API với giao diện đăng nhập
</commit_message>
<xml_diff>
--- a/Documents/Phân tích Ứng dụng Quản lý lịch tập gym.docx
+++ b/Documents/Phân tích Ứng dụng Quản lý lịch tập gym.docx
@@ -5566,15 +5566,7 @@
       </w:r>
       <w:proofErr w:type="spellEnd"/>
       <w:r>
-        <w:t xml:space="preserve"> </w:t>
-      </w:r>
-      <w:proofErr w:type="spellStart"/>
-      <w:r>
-        <w:t>hình</w:t>
-      </w:r>
-      <w:proofErr w:type="spellEnd"/>
-      <w:r>
-        <w:t xml:space="preserve"> sets/reps/rest</w:t>
+        <w:t xml:space="preserve"> hình sets/reps/rest</w:t>
       </w:r>
     </w:p>
     <w:p/>
@@ -5592,15 +5584,7 @@
       </w:r>
       <w:proofErr w:type="spellEnd"/>
       <w:r>
-        <w:t xml:space="preserve"> </w:t>
-      </w:r>
-      <w:proofErr w:type="spellStart"/>
-      <w:r>
-        <w:t>rã</w:t>
-      </w:r>
-      <w:proofErr w:type="spellEnd"/>
-      <w:r>
-        <w:t xml:space="preserve"> UC1</w:t>
+        <w:t xml:space="preserve"> rã UC1</w:t>
       </w:r>
     </w:p>
     <w:p>
@@ -5683,15 +5667,7 @@
       </w:r>
       <w:proofErr w:type="spellEnd"/>
       <w:r>
-        <w:t xml:space="preserve"> </w:t>
-      </w:r>
-      <w:proofErr w:type="spellStart"/>
-      <w:r>
-        <w:t>rã</w:t>
-      </w:r>
-      <w:proofErr w:type="spellEnd"/>
-      <w:r>
-        <w:t xml:space="preserve"> UC2</w:t>
+        <w:t xml:space="preserve"> rã UC2</w:t>
       </w:r>
     </w:p>
     <w:p>
@@ -5772,15 +5748,7 @@
       </w:r>
       <w:proofErr w:type="spellEnd"/>
       <w:r>
-        <w:t xml:space="preserve"> </w:t>
-      </w:r>
-      <w:proofErr w:type="spellStart"/>
-      <w:r>
-        <w:t>rã</w:t>
-      </w:r>
-      <w:proofErr w:type="spellEnd"/>
-      <w:r>
-        <w:t xml:space="preserve"> UC3</w:t>
+        <w:t xml:space="preserve"> rã UC3</w:t>
       </w:r>
     </w:p>
     <w:p>
@@ -5860,15 +5828,7 @@
       </w:r>
       <w:proofErr w:type="spellEnd"/>
       <w:r>
-        <w:t xml:space="preserve"> </w:t>
-      </w:r>
-      <w:proofErr w:type="spellStart"/>
-      <w:r>
-        <w:t>rã</w:t>
-      </w:r>
-      <w:proofErr w:type="spellEnd"/>
-      <w:r>
-        <w:t xml:space="preserve"> UC4</w:t>
+        <w:t xml:space="preserve"> rã UC4</w:t>
       </w:r>
     </w:p>
     <w:p>
@@ -5948,15 +5908,7 @@
       </w:r>
       <w:proofErr w:type="spellEnd"/>
       <w:r>
-        <w:t xml:space="preserve"> </w:t>
-      </w:r>
-      <w:proofErr w:type="spellStart"/>
-      <w:r>
-        <w:t>rã</w:t>
-      </w:r>
-      <w:proofErr w:type="spellEnd"/>
-      <w:r>
-        <w:t xml:space="preserve"> UC5</w:t>
+        <w:t xml:space="preserve"> rã UC5</w:t>
       </w:r>
     </w:p>
     <w:p>
@@ -6037,15 +5989,7 @@
       </w:r>
       <w:proofErr w:type="spellEnd"/>
       <w:r>
-        <w:t xml:space="preserve"> </w:t>
-      </w:r>
-      <w:proofErr w:type="spellStart"/>
-      <w:r>
-        <w:t>rã</w:t>
-      </w:r>
-      <w:proofErr w:type="spellEnd"/>
-      <w:r>
-        <w:t xml:space="preserve"> UC6</w:t>
+        <w:t xml:space="preserve"> rã UC6</w:t>
       </w:r>
     </w:p>
     <w:p>
@@ -6125,15 +6069,7 @@
       </w:r>
       <w:proofErr w:type="spellEnd"/>
       <w:r>
-        <w:t xml:space="preserve"> </w:t>
-      </w:r>
-      <w:proofErr w:type="spellStart"/>
-      <w:r>
-        <w:t>rã</w:t>
-      </w:r>
-      <w:proofErr w:type="spellEnd"/>
-      <w:r>
-        <w:t xml:space="preserve"> UC7</w:t>
+        <w:t xml:space="preserve"> rã UC7</w:t>
       </w:r>
     </w:p>
     <w:p>
@@ -6214,15 +6150,7 @@
       </w:r>
       <w:proofErr w:type="spellEnd"/>
       <w:r>
-        <w:t xml:space="preserve"> </w:t>
-      </w:r>
-      <w:proofErr w:type="spellStart"/>
-      <w:r>
-        <w:t>rã</w:t>
-      </w:r>
-      <w:proofErr w:type="spellEnd"/>
-      <w:r>
-        <w:t xml:space="preserve"> UC8</w:t>
+        <w:t xml:space="preserve"> rã UC8</w:t>
       </w:r>
     </w:p>
     <w:p>
@@ -6330,15 +6258,7 @@
       </w:r>
       <w:proofErr w:type="spellEnd"/>
       <w:r>
-        <w:t xml:space="preserve"> </w:t>
-      </w:r>
-      <w:proofErr w:type="spellStart"/>
-      <w:r>
-        <w:t>rã</w:t>
-      </w:r>
-      <w:proofErr w:type="spellEnd"/>
-      <w:r>
-        <w:t xml:space="preserve"> UC9</w:t>
+        <w:t xml:space="preserve"> rã UC9</w:t>
       </w:r>
     </w:p>
     <w:p>
@@ -6512,15 +6432,7 @@
       </w:r>
       <w:proofErr w:type="spellEnd"/>
       <w:r>
-        <w:t xml:space="preserve"> </w:t>
-      </w:r>
-      <w:proofErr w:type="spellStart"/>
-      <w:r>
-        <w:t>rã</w:t>
-      </w:r>
-      <w:proofErr w:type="spellEnd"/>
-      <w:r>
-        <w:t xml:space="preserve"> UC10</w:t>
+        <w:t xml:space="preserve"> rã UC10</w:t>
       </w:r>
     </w:p>
     <w:p>
@@ -6673,15 +6585,7 @@
       </w:r>
       <w:proofErr w:type="spellEnd"/>
       <w:r>
-        <w:t xml:space="preserve"> </w:t>
-      </w:r>
-      <w:proofErr w:type="spellStart"/>
-      <w:r>
-        <w:t>rã</w:t>
-      </w:r>
-      <w:proofErr w:type="spellEnd"/>
-      <w:r>
-        <w:t xml:space="preserve"> UC11</w:t>
+        <w:t xml:space="preserve"> rã UC11</w:t>
       </w:r>
     </w:p>
     <w:p>
@@ -7058,14 +6962,11 @@
         </w:tabs>
       </w:pPr>
       <w:r>
-        <w:rPr>
-          <w:noProof/>
-        </w:rPr>
         <w:drawing>
-          <wp:inline distT="0" distB="0" distL="0" distR="0" wp14:anchorId="36644F8B" wp14:editId="6649BCCB">
-            <wp:extent cx="6151880" cy="5331460"/>
-            <wp:effectExtent l="0" t="0" r="1270" b="2540"/>
-            <wp:docPr id="1576044291" name="Picture 7"/>
+          <wp:inline distT="0" distB="0" distL="0" distR="0" wp14:anchorId="587F43BB" wp14:editId="41136DAE">
+            <wp:extent cx="6151880" cy="5496560"/>
+            <wp:effectExtent l="0" t="0" r="1270" b="8890"/>
+            <wp:docPr id="1998208143" name="Picture 2"/>
             <wp:cNvGraphicFramePr>
               <a:graphicFrameLocks xmlns:a="http://schemas.openxmlformats.org/drawingml/2006/main" noChangeAspect="1"/>
             </wp:cNvGraphicFramePr>
@@ -7073,7 +6974,7 @@
               <a:graphicData uri="http://schemas.openxmlformats.org/drawingml/2006/picture">
                 <pic:pic xmlns:pic="http://schemas.openxmlformats.org/drawingml/2006/picture">
                   <pic:nvPicPr>
-                    <pic:cNvPr id="0" name="Picture 16"/>
+                    <pic:cNvPr id="0" name="Picture 6"/>
                     <pic:cNvPicPr>
                       <a:picLocks noChangeAspect="1" noChangeArrowheads="1"/>
                     </pic:cNvPicPr>
@@ -7094,7 +6995,7 @@
                   <pic:spPr bwMode="auto">
                     <a:xfrm>
                       <a:off x="0" y="0"/>
-                      <a:ext cx="6151880" cy="5331460"/>
+                      <a:ext cx="6151880" cy="5496560"/>
                     </a:xfrm>
                     <a:prstGeom prst="rect">
                       <a:avLst/>
@@ -7110,6 +7011,13 @@
           </wp:inline>
         </w:drawing>
       </w:r>
+    </w:p>
+    <w:p>
+      <w:pPr>
+        <w:tabs>
+          <w:tab w:val="left" w:pos="6156"/>
+        </w:tabs>
+      </w:pPr>
     </w:p>
     <w:p>
       <w:pPr>

</xml_diff>